<commit_message>
Eksik 6 prosedür yazıldı (EN/AR), kalan eski kodlar çevrildi; tüm atıflar gerçek belgeye bağlı
Co-Authored-By: Claude Sonnet 5.5 <noreply@anthropic.com>
Claude-Session: https://claude.ai/code/session_01J6foNXTwf1dGzDjULYpfrk
</commit_message>
<xml_diff>
--- a/prosedurler/EMS.BY.PRO.06.02. Dyeing and Finishing Process Control Procedure.docx
+++ b/prosedurler/EMS.BY.PRO.06.02. Dyeing and Finishing Process Control Procedure.docx
@@ -3457,7 +3457,7 @@
           <w:sz w:val="24"/>
           <w:szCs w:val="24"/>
         </w:rPr>
-        <w:t xml:space="preserve">EMS.BY.PRO.06.02 إجراء الصباغة وPRS-BOY-04 إجراء التجهيز (نظام الجودة QMS)</w:t>
+        <w:t xml:space="preserve">EMS.BY.PRO.06.02 إجراء الصباغة وEMS.BY.PRO.06.02 إجراء التجهيز (نظام الجودة QMS)</w:t>
       </w:r>
     </w:p>
     <w:p>
@@ -3478,7 +3478,7 @@
           <w:sz w:val="24"/>
           <w:szCs w:val="24"/>
         </w:rPr>
-        <w:t xml:space="preserve">EMS.KM.TL.20.01 تعليمات وزن المواد الكيميائية وإعداد الوصفة، وTLM-BOY-04 تعليمات تحميل الآلة وبرنامج الصباغة، وTLM-BOY-05 تعليمات فتح الأثواب وقص الأنابيب، وTLM-BOY-06 تعليمات ضبط الرام، وTLM-BOY-07 تعليمات الكبس والتجهيز الميكانيكي (QMS)</w:t>
+        <w:t xml:space="preserve">EMS.KM.TL.20.01 تعليمات وزن المواد الكيميائية وإعداد الوصفة، وEMS.BY.TL.06.01 تعليمات تحميل الآلة وبرنامج الصباغة، وEMS.BY.TL.06.06 تعليمات فتح الأثواب وقص الأنابيب، وEMS.BY.TL.06.02 تعليمات ضبط الرام، وEMS.BY.TL.06.02 تعليمات الكبس والتجهيز الميكانيكي (QMS)</w:t>
       </w:r>
     </w:p>
     <w:p>

</xml_diff>

<commit_message>
Eksik 6 prosedür yazıldı (EN/AR), kalan eski kodlar çevrildi; tüm atıflar gerçek belgeye bağlı (#256)
Claude-Session: https://claude.ai/code/session_01J6foNXTwf1dGzDjULYpfrk

Co-authored-by: Claude <noreply@anthropic.com>
</commit_message>
<xml_diff>
--- a/prosedurler/EMS.BY.PRO.06.02. Dyeing and Finishing Process Control Procedure.docx
+++ b/prosedurler/EMS.BY.PRO.06.02. Dyeing and Finishing Process Control Procedure.docx
@@ -3457,7 +3457,7 @@
           <w:sz w:val="24"/>
           <w:szCs w:val="24"/>
         </w:rPr>
-        <w:t xml:space="preserve">EMS.BY.PRO.06.02 إجراء الصباغة وPRS-BOY-04 إجراء التجهيز (نظام الجودة QMS)</w:t>
+        <w:t xml:space="preserve">EMS.BY.PRO.06.02 إجراء الصباغة وEMS.BY.PRO.06.02 إجراء التجهيز (نظام الجودة QMS)</w:t>
       </w:r>
     </w:p>
     <w:p>
@@ -3478,7 +3478,7 @@
           <w:sz w:val="24"/>
           <w:szCs w:val="24"/>
         </w:rPr>
-        <w:t xml:space="preserve">EMS.KM.TL.20.01 تعليمات وزن المواد الكيميائية وإعداد الوصفة، وTLM-BOY-04 تعليمات تحميل الآلة وبرنامج الصباغة، وTLM-BOY-05 تعليمات فتح الأثواب وقص الأنابيب، وTLM-BOY-06 تعليمات ضبط الرام، وTLM-BOY-07 تعليمات الكبس والتجهيز الميكانيكي (QMS)</w:t>
+        <w:t xml:space="preserve">EMS.KM.TL.20.01 تعليمات وزن المواد الكيميائية وإعداد الوصفة، وEMS.BY.TL.06.01 تعليمات تحميل الآلة وبرنامج الصباغة، وEMS.BY.TL.06.06 تعليمات فتح الأثواب وقص الأنابيب، وEMS.BY.TL.06.02 تعليمات ضبط الرام، وEMS.BY.TL.06.02 تعليمات الكبس والتجهيز الميكانيكي (QMS)</w:t>
       </w:r>
     </w:p>
     <w:p>

</xml_diff>